<commit_message>
Final polish: dynamic test count (495), subtle layout spacing, doc rebuild
- Make KPI test count dynamic via _test_count_from_line parsing cover verification line
- Update stale 472 hard-codes to current 495 (tools table, listings)
- Tighten layout: H1/H2 keepWithNext and breathing space for readability
- Rebuild synchronized DOCX/PDF via canonical pipeline, verified consistency

Co-authored-by: arena-agent <297053741+arena-agent@users.noreply.github.com>
</commit_message>
<xml_diff>
--- a/docs/Review_2_Report.docx
+++ b/docs/Review_2_Report.docx
@@ -571,7 +571,7 @@
           <w:i w:val="0"/>
           <w:color w:val="000000"/>
         </w:rPr>
-        <w:t>472 — automated tests passing</w:t>
+        <w:t>495 — automated tests passing</w:t>
       </w:r>
     </w:p>
     <w:p>
@@ -10484,7 +10484,7 @@
                 <w:color w:val="000000"/>
                 <w:sz w:val="17"/>
               </w:rPr>
-              <w:t>the automated test suite (472 tests)</w:t>
+              <w:t>the automated test suite (495 tests, see cover-page verification line)</w:t>
             </w:r>
           </w:p>
         </w:tc>
@@ -18949,7 +18949,7 @@
           <w:color w:val="000000"/>
           <w:sz w:val="17"/>
         </w:rPr>
-        <w:t>472 passed in 49.79s</w:t>
+        <w:t>495 passed in 52.49s</w:t>
       </w:r>
     </w:p>
     <w:p>
@@ -18967,7 +18967,7 @@
           <w:color w:val="000000"/>
           <w:sz w:val="18"/>
         </w:rPr>
-        <w:t>Listing 3 — Test suite.</w:t>
+        <w:t>Listing 3 — Test suite (observed at build).</w:t>
       </w:r>
     </w:p>
     <w:p>
@@ -21269,7 +21269,7 @@
           <w:color w:val="000000"/>
           <w:sz w:val="17"/>
         </w:rPr>
-        <w:t>.venv/bin/python -m pytest -q                       # 472 passed</w:t>
+        <w:t>.venv/bin/python -m pytest -q                       # 495 passed (observed at last build)</w:t>
       </w:r>
     </w:p>
     <w:p>

</xml_diff>